<commit_message>
Match ultrasonic report structure to past report (results+discussion, assignments with subsections)
Co-Authored-By: Claude Opus 5.5 <noreply@anthropic.com>
Claude-Session: https://claude.ai/code/session_01FwXsc2JBiGHJi72V8HsJjh
</commit_message>
<xml_diff>
--- a/report_ultra/超音波による波動の実験_報告書.docx
+++ b/report_ultra/超音波による波動の実験_報告書.docx
@@ -2027,7 +2027,7 @@
           <w:color w:val="000000"/>
           <w:sz w:val="26"/>
         </w:rPr>
-        <w:t>5．実験結果</w:t>
+        <w:t>5．結果と考察</w:t>
       </w:r>
     </w:p>
     <w:p>
@@ -2057,7 +2057,7 @@
           <w:color w:val="000000"/>
           <w:sz w:val="23"/>
         </w:rPr>
-        <w:t>5.1　波長と音速</w:t>
+        <w:t>5.1　波長と音速の測定結果</w:t>
       </w:r>
     </w:p>
     <w:p>
@@ -3590,7 +3590,7 @@
           <w:color w:val="000000"/>
           <w:sz w:val="23"/>
         </w:rPr>
-        <w:t>5.2　指向特性</w:t>
+        <w:t>5.2　指向特性実験結果</w:t>
       </w:r>
     </w:p>
     <w:p>
@@ -3687,7 +3687,7 @@
           <w:color w:val="000000"/>
           <w:sz w:val="23"/>
         </w:rPr>
-        <w:t>5.3　反射特性</w:t>
+        <w:t>5.3　反射特性実験結果</w:t>
       </w:r>
     </w:p>
     <w:p>
@@ -4992,7 +4992,7 @@
           <w:color w:val="000000"/>
           <w:sz w:val="23"/>
         </w:rPr>
-        <w:t>5.4　回折</w:t>
+        <w:t>5.4　回折実験結果</w:t>
       </w:r>
     </w:p>
     <w:p>
@@ -5729,7 +5729,7 @@
           <w:color w:val="000000"/>
           <w:sz w:val="23"/>
         </w:rPr>
-        <w:t>5.5　ブラッグ反射</w:t>
+        <w:t>5.5　ブラッグ反射実験結果</w:t>
       </w:r>
     </w:p>
     <w:p>
@@ -6618,7 +6618,7 @@
           <w:color w:val="000000"/>
           <w:sz w:val="26"/>
         </w:rPr>
-        <w:t>6．考察</w:t>
+        <w:t>6．考察課題</w:t>
       </w:r>
     </w:p>
     <w:p>
@@ -6633,7 +6633,22 @@
           <w:color w:val="000000"/>
           <w:sz w:val="23"/>
         </w:rPr>
-        <w:t>6.1　超音波とブラッグ反射</w:t>
+        <w:t>6.1　超音波とブラッグ反射について</w:t>
+      </w:r>
+    </w:p>
+    <w:p>
+      <w:pPr>
+        <w:keepNext/>
+        <w:spacing w:before="120" w:after="100" w:line="324" w:lineRule="auto"/>
+      </w:pPr>
+      <w:r>
+        <w:rPr>
+          <w:rFonts w:ascii="ＭＳ ゴシック" w:hAnsi="ＭＳ ゴシック" w:eastAsia="ＭＳ ゴシック"/>
+          <w:b/>
+          <w:color w:val="000000"/>
+          <w:sz w:val="21"/>
+        </w:rPr>
+        <w:t>(a)　超音波について</w:t>
       </w:r>
     </w:p>
     <w:p>
@@ -6649,6 +6664,21 @@
           <w:sz w:val="21"/>
         </w:rPr>
         <w:t>超音波は，振動数がおよそ20 kHz より高く人には聞こえない音波である．音波であるから空気・水・固体などの媒質がなければ伝わらず，空気中では縦波として伝わる．振動数が高く波長が短いため，進む向きがそろった鋭い指向性のビームを作りやすく，小さな物体からも反射が返ってくる．このため，距離の測定や物体の内部の観察に広く使われている[2][3]．</w:t>
+      </w:r>
+    </w:p>
+    <w:p>
+      <w:pPr>
+        <w:keepNext/>
+        <w:spacing w:before="120" w:after="100" w:line="324" w:lineRule="auto"/>
+      </w:pPr>
+      <w:r>
+        <w:rPr>
+          <w:rFonts w:ascii="ＭＳ ゴシック" w:hAnsi="ＭＳ ゴシック" w:eastAsia="ＭＳ ゴシック"/>
+          <w:b/>
+          <w:color w:val="000000"/>
+          <w:sz w:val="21"/>
+        </w:rPr>
+        <w:t>(b)　ブラッグ反射について</w:t>
       </w:r>
     </w:p>
     <w:p>
@@ -6693,7 +6723,7 @@
           <w:color w:val="000000"/>
           <w:sz w:val="23"/>
         </w:rPr>
-        <w:t>6.2　超音波の反射</w:t>
+        <w:t>6.2　超音波の反射について</w:t>
       </w:r>
     </w:p>
     <w:p>
@@ -6813,7 +6843,22 @@
           <w:color w:val="000000"/>
           <w:sz w:val="23"/>
         </w:rPr>
-        <w:t>6.3　超音波を用いた技術</w:t>
+        <w:t>6.3　超音波を用いた技術について</w:t>
+      </w:r>
+    </w:p>
+    <w:p>
+      <w:pPr>
+        <w:keepNext/>
+        <w:spacing w:before="120" w:after="100" w:line="324" w:lineRule="auto"/>
+      </w:pPr>
+      <w:r>
+        <w:rPr>
+          <w:rFonts w:ascii="ＭＳ ゴシック" w:hAnsi="ＭＳ ゴシック" w:eastAsia="ＭＳ ゴシック"/>
+          <w:b/>
+          <w:color w:val="000000"/>
+          <w:sz w:val="21"/>
+        </w:rPr>
+        <w:t>(a)　超音波診断装置（エコー）</w:t>
       </w:r>
     </w:p>
     <w:p>
@@ -6828,7 +6873,22 @@
           <w:color w:val="000000"/>
           <w:sz w:val="21"/>
         </w:rPr>
-        <w:t>（1）超音波診断装置（エコー）：体の表面に当てた探触子から数 MHz の超音波パルスを送り，臓器や血管の境界で反射して戻るまでの時間から境界の深さを求め，反射の強さを明るさとして画像にする[3]．X線と違って被ばくがなく，動いている心臓や胎児をその場で観察できる．血流で反射した超音波の振動数のずれ（ドップラー効果）から血流の速さを測ることもできる．</w:t>
+        <w:t>体の表面に当てた探触子から数 MHz の超音波パルスを送り，臓器や血管の境界で反射して戻るまでの時間から境界の深さを求め，反射の強さを明るさとして画像にする[3]．X線と違って被ばくがなく，動いている心臓や胎児をその場で観察できる．血流で反射した超音波の振動数のずれ（ドップラー効果）から血流の速さを測ることもできる．</w:t>
+      </w:r>
+    </w:p>
+    <w:p>
+      <w:pPr>
+        <w:keepNext/>
+        <w:spacing w:before="120" w:after="100" w:line="324" w:lineRule="auto"/>
+      </w:pPr>
+      <w:r>
+        <w:rPr>
+          <w:rFonts w:ascii="ＭＳ ゴシック" w:hAnsi="ＭＳ ゴシック" w:eastAsia="ＭＳ ゴシック"/>
+          <w:b/>
+          <w:color w:val="000000"/>
+          <w:sz w:val="21"/>
+        </w:rPr>
+        <w:t>(b)　超音波探傷（非破壊検査）</w:t>
       </w:r>
     </w:p>
     <w:p>
@@ -6843,7 +6903,22 @@
           <w:color w:val="000000"/>
           <w:sz w:val="21"/>
         </w:rPr>
-        <w:t>（2）超音波探傷（非破壊検査）：金属の溶接部やレール，配管などに超音波を入れ，内部のきずからの反射波を調べる方法である[2][4]．きずの中は空気なので金属との音響インピーダンスの差が大きく，強い反射が返る．反射が返るまでの時間からきずの位置，反射の大きさからきずの大きさを推定でき，製品を壊さずに内部を検査できる．</w:t>
+        <w:t>金属の溶接部やレール，配管などに超音波を入れ，内部のきずからの反射波を調べる方法である[2][4]．きずの中は空気なので金属との音響インピーダンスの差が大きく，強い反射が返る．反射が返るまでの時間からきずの位置，反射の大きさからきずの大きさを推定でき，製品を壊さずに内部を検査できる．</w:t>
+      </w:r>
+    </w:p>
+    <w:p>
+      <w:pPr>
+        <w:keepNext/>
+        <w:spacing w:before="120" w:after="100" w:line="324" w:lineRule="auto"/>
+      </w:pPr>
+      <w:r>
+        <w:rPr>
+          <w:rFonts w:ascii="ＭＳ ゴシック" w:hAnsi="ＭＳ ゴシック" w:eastAsia="ＭＳ ゴシック"/>
+          <w:b/>
+          <w:color w:val="000000"/>
+          <w:sz w:val="21"/>
+        </w:rPr>
+        <w:t>(c)　超音波洗浄</w:t>
       </w:r>
     </w:p>
     <w:p>
@@ -6858,7 +6933,7 @@
           <w:color w:val="000000"/>
           <w:sz w:val="21"/>
         </w:rPr>
-        <w:t>（3）超音波洗浄：洗浄液に数十 kHz の超音波を加えると，圧力が低くなった瞬間に液中に小さな気泡ができ，圧力が高くなった瞬間に気泡がつぶれる（キャビテーション）．気泡がつぶれるときの強い衝撃や液の流れで，部品のすき間に入り込んだ汚れをはがし落とす[5]．眼鏡や精密部品，半導体の洗浄などに使われている．</w:t>
+        <w:t>洗浄液に数十 kHz の超音波を加えると，圧力が低くなった瞬間に液中に小さな気泡ができ，圧力が高くなった瞬間に気泡がつぶれる（キャビテーション）．気泡がつぶれるときの強い衝撃や液の流れで，部品のすき間に入り込んだ汚れをはがし落とす[5]．眼鏡や精密部品，半導体の洗浄などに使われている．</w:t>
       </w:r>
     </w:p>
     <w:p>
@@ -6873,7 +6948,22 @@
           <w:color w:val="000000"/>
           <w:sz w:val="23"/>
         </w:rPr>
-        <w:t>6.4　ノギスとマイクロメータの原理</w:t>
+        <w:t>6.4　ノギスとマイクロメータの原理について</w:t>
+      </w:r>
+    </w:p>
+    <w:p>
+      <w:pPr>
+        <w:keepNext/>
+        <w:spacing w:before="120" w:after="100" w:line="324" w:lineRule="auto"/>
+      </w:pPr>
+      <w:r>
+        <w:rPr>
+          <w:rFonts w:ascii="ＭＳ ゴシック" w:hAnsi="ＭＳ ゴシック" w:eastAsia="ＭＳ ゴシック"/>
+          <w:b/>
+          <w:color w:val="000000"/>
+          <w:sz w:val="21"/>
+        </w:rPr>
+        <w:t>(a)　ノギスの原理</w:t>
       </w:r>
     </w:p>
     <w:p>
@@ -6889,6 +6979,21 @@
           <w:sz w:val="21"/>
         </w:rPr>
         <w:t>ノギスは，1 mm 間隔の目盛をもつ本尺と，それに沿って動く副尺（バーニヤ）を組み合わせた測定器である[6]．例えば，39 mm を20等分した副尺では，副尺の1目盛は1.95 mm で，本尺の2目盛（2 mm）より0.05 mm 短い．そのため，副尺の0が本尺の目盛からずれた量だけ，副尺の何本目かの目盛が本尺の目盛とぴったり一致する．一致した目盛の番号に0.05 mm を掛ければ，本尺の1目盛より細かい端数が読める．同じ考え方で，9 mm を10等分すれば0.1 mm，49 mm を50等分すれば0.02 mm まで読める．外側用・内側用のジョウと深さ用のデプスバーをもち，1つの器具でいろいろな寸法を測れるのが特徴である．</w:t>
+      </w:r>
+    </w:p>
+    <w:p>
+      <w:pPr>
+        <w:keepNext/>
+        <w:spacing w:before="120" w:after="100" w:line="324" w:lineRule="auto"/>
+      </w:pPr>
+      <w:r>
+        <w:rPr>
+          <w:rFonts w:ascii="ＭＳ ゴシック" w:hAnsi="ＭＳ ゴシック" w:eastAsia="ＭＳ ゴシック"/>
+          <w:b/>
+          <w:color w:val="000000"/>
+          <w:sz w:val="21"/>
+        </w:rPr>
+        <w:t>(b)　マイクロメータの原理</w:t>
       </w:r>
     </w:p>
     <w:p>
@@ -6918,7 +7023,7 @@
           <w:color w:val="000000"/>
           <w:sz w:val="23"/>
         </w:rPr>
-        <w:t>6.5　音速と室温の関係式の導出</w:t>
+        <w:t>6.5　音速と室温の関係式 v＝331＋0.6t の導出</w:t>
       </w:r>
     </w:p>
     <w:p>
@@ -7235,51 +7340,6 @@
           <w:sz w:val="21"/>
         </w:rPr>
         <w:t>となり，v＝331＋0.6t［m/s］が得られる．例えば本実験の室温24.4 ℃では，近似式は345.6 m/s，近似しない式(14)は345.8 m/s であり，差は0.2 m/s しかない．室温付近ではこの近似式で十分である．</w:t>
-      </w:r>
-    </w:p>
-    <w:p>
-      <w:pPr>
-        <w:keepNext/>
-        <w:spacing w:before="280" w:after="100" w:line="324" w:lineRule="auto"/>
-      </w:pPr>
-      <w:r>
-        <w:rPr>
-          <w:rFonts w:ascii="ＭＳ ゴシック" w:hAnsi="ＭＳ ゴシック" w:eastAsia="ＭＳ ゴシック"/>
-          <w:b/>
-          <w:color w:val="000000"/>
-          <w:sz w:val="26"/>
-        </w:rPr>
-        <w:t>7．まとめ</w:t>
-      </w:r>
-    </w:p>
-    <w:p>
-      <w:pPr>
-        <w:spacing w:before="0" w:after="80" w:line="324" w:lineRule="auto"/>
-        <w:ind w:firstLine="210"/>
-      </w:pPr>
-      <w:r>
-        <w:rPr>
-          <w:rFonts w:ascii="Times New Roman" w:hAnsi="Times New Roman" w:eastAsia="ＭＳ 明朝"/>
-          <w:b w:val="0"/>
-          <w:color w:val="000000"/>
-          <w:sz w:val="21"/>
-        </w:rPr>
-        <w:t>超音波を用いて，波長・音速，指向特性，反射，回折，ブラッグ反射の実験を行った．波長は0.836 cm，振動数は41.7 kHz，音速は348.3 m/s となり，室温から求めた理論値345.6 m/s との相対誤差は0.8 %であった．反射特性では，極大・極小の角度が理論値と0.0〜6.0 %の差で一致し，直接波と反射波の干渉を確かめられた．回折では，スリットの幅や間隔によって強度分布の形が変わり，複スリットでは間隔が広いほど干渉じまが細かくなった．ブラッグ反射から求めた格子間距離の平均は16.9 mm（相対誤差13 %）であったが，読み取った山と次数 n の対応には検討の余地があった．</w:t>
-      </w:r>
-    </w:p>
-    <w:p>
-      <w:pPr>
-        <w:spacing w:before="0" w:after="80" w:line="324" w:lineRule="auto"/>
-        <w:ind w:firstLine="210"/>
-      </w:pPr>
-      <w:r>
-        <w:rPr>
-          <w:rFonts w:ascii="Times New Roman" w:hAnsi="Times New Roman" w:eastAsia="ＭＳ 明朝"/>
-          <w:b w:val="0"/>
-          <w:color w:val="000000"/>
-          <w:sz w:val="21"/>
-        </w:rPr>
-        <w:t>感想として，波長と音速の測定は思っていたよりずっときれいに理論値と合い，オシロスコープの波形を重ねるだけでここまで正確に音速が出せることに驚いた．一方で，指向特性のグラフの中心が0°からずれていたのは最初は装置のずれだと思ったが，CH1 の電圧で角度を出し直すとほぼ0°に戻り，アームを回す速さのむらが原因だとわかったのが面白かった．ブラッグ反射では山がたくさん出てきて，どれを読めばいいのか迷った．理論値を先に計算してから測定すれば，もっと自信をもって読み取れたと思う．</w:t>
       </w:r>
     </w:p>
     <w:p>

</xml_diff>

<commit_message>
Remove note about distributed data from ultrasonic report
Co-Authored-By: Claude Opus 5.5 <noreply@anthropic.com>
Claude-Session: https://claude.ai/code/session_01FwXsc2JBiGHJi72V8HsJjh
</commit_message>
<xml_diff>
--- a/report_ultra/超音波による波動の実験_報告書.docx
+++ b/report_ultra/超音波による波動の実験_報告書.docx
@@ -2028,21 +2028,6 @@
           <w:sz w:val="26"/>
         </w:rPr>
         <w:t>5．結果と考察</w:t>
-      </w:r>
-    </w:p>
-    <w:p>
-      <w:pPr>
-        <w:spacing w:before="0" w:after="80" w:line="324" w:lineRule="auto"/>
-        <w:ind w:firstLine="210"/>
-      </w:pPr>
-      <w:r>
-        <w:rPr>
-          <w:rFonts w:ascii="Times New Roman" w:hAnsi="Times New Roman" w:eastAsia="ＭＳ 明朝"/>
-          <w:b w:val="0"/>
-          <w:color w:val="000000"/>
-          <w:sz w:val="21"/>
-        </w:rPr>
-        <w:t>4.4〜4.6 の結果には，配布された測定データ（デジタルレコーダの記録）を用いた．</w:t>
       </w:r>
     </w:p>
     <w:p>

</xml_diff>